<commit_message>
feat: :sparkles: New CSV sample Student 3 entities
</commit_message>
<xml_diff>
--- a/reports/Student #3/03 - Requirements - Student #3.docx
+++ b/reports/Student #3/03 - Requirements - Student #3.docx
@@ -111,7 +111,6 @@
               </w:rPr>
               <w:tab/>
             </w:r>
-            <w:permStart w:id="379328249" w:edGrp="everyone"/>
             <w:sdt>
               <w:sdtPr>
                 <w:rPr>
@@ -125,6 +124,7 @@
                 <w15:appearance w15:val="hidden"/>
                 <w:text/>
               </w:sdtPr>
+              <w:sdtEndPr/>
               <w:sdtContent>
                 <w:r>
                   <w:rPr>
@@ -134,7 +134,6 @@
                 </w:r>
               </w:sdtContent>
             </w:sdt>
-            <w:permEnd w:id="379328249"/>
           </w:p>
         </w:tc>
       </w:tr>
@@ -180,7 +179,6 @@
               </w:rPr>
               <w:tab/>
             </w:r>
-            <w:permStart w:id="955522721" w:edGrp="everyone"/>
             <w:sdt>
               <w:sdtPr>
                 <w:rPr>
@@ -195,6 +193,7 @@
                 <w15:appearance w15:val="hidden"/>
                 <w:text/>
               </w:sdtPr>
+              <w:sdtEndPr/>
               <w:sdtContent>
                 <w:r>
                   <w:rPr>
@@ -205,7 +204,6 @@
                 </w:r>
               </w:sdtContent>
             </w:sdt>
-            <w:permEnd w:id="955522721"/>
           </w:p>
         </w:tc>
       </w:tr>
@@ -248,7 +246,6 @@
               </w:rPr>
               <w:tab/>
             </w:r>
-            <w:permStart w:id="1490430286" w:edGrp="everyone"/>
             <w:r>
               <w:rPr>
                 <w:rFonts w:asciiTheme="majorHAnsi" w:hAnsiTheme="majorHAnsi" w:cstheme="majorBidi"/>
@@ -268,6 +265,7 @@
                 <w15:appearance w15:val="hidden"/>
                 <w:text/>
               </w:sdtPr>
+              <w:sdtEndPr/>
               <w:sdtContent>
                 <w:r>
                   <w:rPr>
@@ -284,7 +282,6 @@
               </w:sdtContent>
             </w:sdt>
           </w:p>
-          <w:permEnd w:id="1490430286"/>
           <w:p>
             <w:pPr>
               <w:pStyle w:val="Sinespaciado"/>
@@ -314,7 +311,6 @@
               </w:rPr>
               <w:tab/>
             </w:r>
-            <w:permStart w:id="1588551831" w:edGrp="everyone"/>
             <w:sdt>
               <w:sdtPr>
                 <w:rPr>
@@ -328,6 +324,7 @@
                 <w15:appearance w15:val="hidden"/>
                 <w:text/>
               </w:sdtPr>
+              <w:sdtEndPr/>
               <w:sdtContent>
                 <w:r>
                   <w:rPr>
@@ -349,7 +346,6 @@
                 </w:r>
               </w:sdtContent>
             </w:sdt>
-            <w:permEnd w:id="1588551831"/>
           </w:p>
           <w:p>
             <w:pPr>
@@ -378,7 +374,6 @@
               </w:rPr>
               <w:tab/>
             </w:r>
-            <w:permStart w:id="441854091" w:edGrp="everyone"/>
             <w:sdt>
               <w:sdtPr>
                 <w:rPr>
@@ -392,6 +387,7 @@
                 <w15:appearance w15:val="hidden"/>
                 <w:text/>
               </w:sdtPr>
+              <w:sdtEndPr/>
               <w:sdtContent>
                 <w:r>
                   <w:rPr>
@@ -413,7 +409,6 @@
                 </w:r>
               </w:sdtContent>
             </w:sdt>
-            <w:permEnd w:id="441854091"/>
           </w:p>
           <w:p>
             <w:pPr>
@@ -442,7 +437,6 @@
               </w:rPr>
               <w:tab/>
             </w:r>
-            <w:permStart w:id="16126159" w:edGrp="everyone"/>
             <w:sdt>
               <w:sdtPr>
                 <w:rPr>
@@ -456,6 +450,7 @@
                 <w15:appearance w15:val="hidden"/>
                 <w:text/>
               </w:sdtPr>
+              <w:sdtEndPr/>
               <w:sdtContent>
                 <w:r>
                   <w:rPr>
@@ -477,7 +472,6 @@
                 </w:r>
               </w:sdtContent>
             </w:sdt>
-            <w:permEnd w:id="16126159"/>
           </w:p>
         </w:tc>
       </w:tr>
@@ -525,11 +519,11 @@
               </w:rPr>
               <w:tab/>
             </w:r>
-            <w:permStart w:id="925041655" w:edGrp="everyone"/>
             <w:sdt>
               <w:sdtPr>
                 <w:rPr>
                   <w:rFonts w:asciiTheme="majorHAnsi" w:hAnsiTheme="majorHAnsi" w:cstheme="majorHAnsi"/>
+                  <w:u w:val="single"/>
                 </w:rPr>
                 <w:tag w:val="Moment"/>
                 <w:id w:val="-131097587"/>
@@ -539,22 +533,59 @@
                 <w15:appearance w15:val="hidden"/>
                 <w:text/>
               </w:sdtPr>
+              <w:sdtEndPr/>
               <w:sdtContent>
                 <w:r>
                   <w:rPr>
                     <w:rFonts w:asciiTheme="majorHAnsi" w:hAnsiTheme="majorHAnsi" w:cstheme="majorHAnsi"/>
+                    <w:u w:val="single"/>
                   </w:rPr>
                   <w:t xml:space="preserve"> </w:t>
                 </w:r>
                 <w:r>
                   <w:rPr>
                     <w:rFonts w:asciiTheme="majorHAnsi" w:hAnsiTheme="majorHAnsi" w:cstheme="majorHAnsi"/>
+                    <w:u w:val="single"/>
                   </w:rPr>
-                  <w:t>Seville, 17 of February, 2025</w:t>
+                  <w:t xml:space="preserve">Seville, </w:t>
+                </w:r>
+                <w:r>
+                  <w:rPr>
+                    <w:rFonts w:asciiTheme="majorHAnsi" w:hAnsiTheme="majorHAnsi" w:cstheme="majorHAnsi"/>
+                    <w:u w:val="single"/>
+                  </w:rPr>
+                  <w:t>1</w:t>
+                </w:r>
+                <w:r>
+                  <w:rPr>
+                    <w:rFonts w:asciiTheme="majorHAnsi" w:hAnsiTheme="majorHAnsi" w:cstheme="majorHAnsi"/>
+                    <w:u w:val="single"/>
+                  </w:rPr>
+                  <w:t>3</w:t>
+                </w:r>
+                <w:r>
+                  <w:rPr>
+                    <w:rFonts w:asciiTheme="majorHAnsi" w:hAnsiTheme="majorHAnsi" w:cstheme="majorHAnsi"/>
+                    <w:u w:val="single"/>
+                  </w:rPr>
+                  <w:t xml:space="preserve"> of </w:t>
+                </w:r>
+                <w:r>
+                  <w:rPr>
+                    <w:rFonts w:asciiTheme="majorHAnsi" w:hAnsiTheme="majorHAnsi" w:cstheme="majorHAnsi"/>
+                    <w:u w:val="single"/>
+                  </w:rPr>
+                  <w:t>March</w:t>
+                </w:r>
+                <w:r>
+                  <w:rPr>
+                    <w:rFonts w:asciiTheme="majorHAnsi" w:hAnsiTheme="majorHAnsi" w:cstheme="majorHAnsi"/>
+                    <w:u w:val="single"/>
+                  </w:rPr>
+                  <w:t>, 2025</w:t>
                 </w:r>
               </w:sdtContent>
             </w:sdt>
-            <w:permEnd w:id="925041655"/>
           </w:p>
         </w:tc>
       </w:tr>
@@ -564,7 +595,6 @@
         <w:pStyle w:val="Ttulo1"/>
       </w:pPr>
       <w:r>
-        <w:lastRenderedPageBreak/>
         <w:t>MANDATORY</w:t>
       </w:r>
       <w:r>
@@ -726,7 +756,6 @@
         <w:t xml:space="preserve">. </w:t>
       </w:r>
     </w:p>
-    <w:permStart w:id="1733719730" w:edGrp="everyone"/>
     <w:p>
       <w:pPr>
         <w:pStyle w:val="Comment-Grader"/>
@@ -741,6 +770,7 @@
           <w15:appearance w15:val="hidden"/>
           <w:text/>
         </w:sdtPr>
+        <w:sdtEndPr/>
         <w:sdtContent>
           <w:r>
             <w:t xml:space="preserve"> </w:t>
@@ -754,11 +784,7 @@
         </w:sdtContent>
       </w:sdt>
       <w:r>
-        <w:t xml:space="preserve"> </w:t>
-      </w:r>
-      <w:permEnd w:id="1733719730"/>
-      <w:r>
-        <w:t xml:space="preserve">   </w:t>
+        <w:t xml:space="preserve">    </w:t>
       </w:r>
     </w:p>
     <w:p>
@@ -815,7 +841,6 @@
         <w:t xml:space="preserve">.  </w:t>
       </w:r>
     </w:p>
-    <w:permStart w:id="244456920" w:edGrp="everyone"/>
     <w:p>
       <w:pPr>
         <w:pStyle w:val="Comment-Grader"/>
@@ -830,6 +855,7 @@
           <w15:appearance w15:val="hidden"/>
           <w:text/>
         </w:sdtPr>
+        <w:sdtEndPr/>
         <w:sdtContent>
           <w:r>
             <w:t xml:space="preserve">  </w:t>
@@ -842,7 +868,6 @@
           </w:r>
         </w:sdtContent>
       </w:sdt>
-      <w:permEnd w:id="244456920"/>
       <w:r>
         <w:t xml:space="preserve">   </w:t>
       </w:r>
@@ -896,7 +921,6 @@
         </w:rPr>
       </w:pPr>
       <w:r>
-        <w:lastRenderedPageBreak/>
         <w:t>MANDATORY</w:t>
       </w:r>
       <w:r>
@@ -1112,7 +1136,6 @@
         <w:t>.</w:t>
       </w:r>
     </w:p>
-    <w:permStart w:id="1580534963" w:edGrp="everyone"/>
     <w:p>
       <w:pPr>
         <w:pStyle w:val="Comment-Grader"/>
@@ -1127,13 +1150,19 @@
           <w15:appearance w15:val="hidden"/>
           <w:text/>
         </w:sdtPr>
+        <w:sdtEndPr/>
         <w:sdtContent>
           <w:r>
-            <w:t xml:space="preserve">    </w:t>
+            <w:t xml:space="preserve">  </w:t>
+          </w:r>
+          <w:r>
+            <w:t>X</w:t>
+          </w:r>
+          <w:r>
+            <w:t xml:space="preserve">  </w:t>
           </w:r>
         </w:sdtContent>
       </w:sdt>
-      <w:permEnd w:id="1580534963"/>
       <w:r>
         <w:t xml:space="preserve">  </w:t>
       </w:r>
@@ -1229,7 +1258,6 @@
       </w:r>
       <w:bookmarkEnd w:id="0"/>
     </w:p>
-    <w:permStart w:id="1685676958" w:edGrp="everyone"/>
     <w:p>
       <w:pPr>
         <w:pStyle w:val="Comment-Grader"/>
@@ -1244,13 +1272,19 @@
           <w15:appearance w15:val="hidden"/>
           <w:text/>
         </w:sdtPr>
+        <w:sdtEndPr/>
         <w:sdtContent>
           <w:r>
-            <w:t xml:space="preserve">    </w:t>
+            <w:t xml:space="preserve"> </w:t>
+          </w:r>
+          <w:r>
+            <w:t>X</w:t>
+          </w:r>
+          <w:r>
+            <w:t xml:space="preserve">  </w:t>
           </w:r>
         </w:sdtContent>
       </w:sdt>
-      <w:permEnd w:id="1685676958"/>
       <w:r>
         <w:t xml:space="preserve"> </w:t>
       </w:r>
@@ -1396,7 +1430,6 @@
       </w:r>
     </w:p>
     <w:bookmarkStart w:id="1" w:name="_Hlk157677981"/>
-    <w:permStart w:id="339812661" w:edGrp="everyone"/>
     <w:p>
       <w:pPr>
         <w:pStyle w:val="Comment-Grader"/>
@@ -1410,13 +1443,19 @@
           </w:placeholder>
           <w:text/>
         </w:sdtPr>
+        <w:sdtEndPr/>
         <w:sdtContent>
           <w:r>
-            <w:t xml:space="preserve">    </w:t>
+            <w:t xml:space="preserve"> </w:t>
+          </w:r>
+          <w:r>
+            <w:t xml:space="preserve"> X</w:t>
+          </w:r>
+          <w:r>
+            <w:t xml:space="preserve">   </w:t>
           </w:r>
         </w:sdtContent>
       </w:sdt>
-      <w:permEnd w:id="339812661"/>
       <w:r>
         <w:t xml:space="preserve">   </w:t>
       </w:r>
@@ -1459,7 +1498,6 @@
         <w:pStyle w:val="Ttulo2"/>
       </w:pPr>
       <w:r>
-        <w:lastRenderedPageBreak/>
         <w:t>Testing requirements</w:t>
       </w:r>
     </w:p>
@@ -1594,7 +1632,6 @@
         <w:t xml:space="preserve"> </w:t>
       </w:r>
     </w:p>
-    <w:permStart w:id="891315281" w:edGrp="everyone"/>
     <w:p>
       <w:pPr>
         <w:pStyle w:val="Comment-Grader"/>
@@ -1609,13 +1646,19 @@
           <w15:appearance w15:val="hidden"/>
           <w:text/>
         </w:sdtPr>
+        <w:sdtEndPr/>
         <w:sdtContent>
           <w:r>
-            <w:t xml:space="preserve">    </w:t>
+            <w:t xml:space="preserve"> </w:t>
+          </w:r>
+          <w:r>
+            <w:t xml:space="preserve"> X</w:t>
+          </w:r>
+          <w:r>
+            <w:t xml:space="preserve">   </w:t>
           </w:r>
         </w:sdtContent>
       </w:sdt>
-      <w:permEnd w:id="891315281"/>
     </w:p>
     <w:p>
       <w:pPr>
@@ -1639,7 +1682,6 @@
         <w:t xml:space="preserve">.  </w:t>
       </w:r>
     </w:p>
-    <w:permStart w:id="338698352" w:edGrp="everyone"/>
     <w:p>
       <w:pPr>
         <w:pStyle w:val="Comment-Grader"/>
@@ -1654,13 +1696,19 @@
           <w15:appearance w15:val="hidden"/>
           <w:text/>
         </w:sdtPr>
+        <w:sdtEndPr/>
         <w:sdtContent>
           <w:r>
-            <w:t xml:space="preserve">    </w:t>
+            <w:t xml:space="preserve"> </w:t>
+          </w:r>
+          <w:r>
+            <w:t>X</w:t>
+          </w:r>
+          <w:r>
+            <w:t xml:space="preserve">  </w:t>
           </w:r>
         </w:sdtContent>
       </w:sdt>
-      <w:permEnd w:id="338698352"/>
       <w:r>
         <w:t xml:space="preserve">   </w:t>
       </w:r>
@@ -1671,7 +1719,6 @@
         <w:pStyle w:val="Ttulo1"/>
       </w:pPr>
       <w:r>
-        <w:lastRenderedPageBreak/>
         <w:t>MANDATORY</w:t>
       </w:r>
       <w:r>
@@ -1897,7 +1944,6 @@
         <w:t>.</w:t>
       </w:r>
     </w:p>
-    <w:permStart w:id="8470091" w:edGrp="everyone"/>
     <w:p>
       <w:pPr>
         <w:pStyle w:val="Comment-Grader"/>
@@ -1912,13 +1958,13 @@
           <w15:appearance w15:val="hidden"/>
           <w:text/>
         </w:sdtPr>
+        <w:sdtEndPr/>
         <w:sdtContent>
           <w:r>
             <w:t xml:space="preserve">    </w:t>
           </w:r>
         </w:sdtContent>
       </w:sdt>
-      <w:permEnd w:id="8470091"/>
       <w:r>
         <w:t xml:space="preserve">    </w:t>
       </w:r>
@@ -2026,7 +2072,6 @@
         <w:t xml:space="preserve">. </w:t>
       </w:r>
     </w:p>
-    <w:permStart w:id="66585966" w:edGrp="everyone"/>
     <w:p>
       <w:pPr>
         <w:pStyle w:val="Comment-Grader"/>
@@ -2041,13 +2086,13 @@
           <w15:appearance w15:val="hidden"/>
           <w:text/>
         </w:sdtPr>
+        <w:sdtEndPr/>
         <w:sdtContent>
           <w:r>
             <w:t xml:space="preserve">    </w:t>
           </w:r>
         </w:sdtContent>
       </w:sdt>
-      <w:permEnd w:id="66585966"/>
       <w:r>
         <w:t xml:space="preserve">    </w:t>
       </w:r>
@@ -2089,7 +2134,6 @@
         <w:pStyle w:val="Ttulo2"/>
       </w:pPr>
       <w:r>
-        <w:lastRenderedPageBreak/>
         <w:t>Managerial requirements</w:t>
       </w:r>
     </w:p>
@@ -2107,7 +2151,6 @@
         <w:t xml:space="preserve">.  </w:t>
       </w:r>
     </w:p>
-    <w:permStart w:id="1123494185" w:edGrp="everyone"/>
     <w:p>
       <w:pPr>
         <w:pStyle w:val="Comment-Grader"/>
@@ -2122,13 +2165,13 @@
           <w15:appearance w15:val="hidden"/>
           <w:text/>
         </w:sdtPr>
+        <w:sdtEndPr/>
         <w:sdtContent>
           <w:r>
             <w:t xml:space="preserve">    </w:t>
           </w:r>
         </w:sdtContent>
       </w:sdt>
-      <w:permEnd w:id="1123494185"/>
       <w:r>
         <w:t xml:space="preserve">   </w:t>
       </w:r>
@@ -2138,7 +2181,6 @@
         <w:pStyle w:val="Ttulo1"/>
       </w:pPr>
       <w:r>
-        <w:lastRenderedPageBreak/>
         <w:t>MANDATORY</w:t>
       </w:r>
       <w:r>
@@ -2176,7 +2218,6 @@
         <w:t xml:space="preserve">  </w:t>
       </w:r>
     </w:p>
-    <w:permStart w:id="955400387" w:edGrp="everyone"/>
     <w:p>
       <w:pPr>
         <w:pStyle w:val="Comment-Grader"/>
@@ -2191,13 +2232,13 @@
           <w15:appearance w15:val="hidden"/>
           <w:text/>
         </w:sdtPr>
+        <w:sdtEndPr/>
         <w:sdtContent>
           <w:r>
             <w:t xml:space="preserve">    </w:t>
           </w:r>
         </w:sdtContent>
       </w:sdt>
-      <w:permEnd w:id="955400387"/>
       <w:r>
         <w:t xml:space="preserve">   </w:t>
       </w:r>
@@ -2262,7 +2303,6 @@
         <w:t xml:space="preserve">. </w:t>
       </w:r>
     </w:p>
-    <w:permStart w:id="973563344" w:edGrp="everyone"/>
     <w:p>
       <w:pPr>
         <w:pStyle w:val="Comment-Grader"/>
@@ -2276,13 +2316,13 @@
           </w:placeholder>
           <w:text/>
         </w:sdtPr>
+        <w:sdtEndPr/>
         <w:sdtContent>
           <w:r>
             <w:t xml:space="preserve">    </w:t>
           </w:r>
         </w:sdtContent>
       </w:sdt>
-      <w:permEnd w:id="973563344"/>
       <w:r>
         <w:t xml:space="preserve">   </w:t>
       </w:r>
@@ -2315,7 +2355,6 @@
         <w:t xml:space="preserve"> </w:t>
       </w:r>
     </w:p>
-    <w:permStart w:id="182535402" w:edGrp="everyone"/>
     <w:p>
       <w:pPr>
         <w:pStyle w:val="Comment-Grader"/>
@@ -2330,13 +2369,13 @@
           <w15:appearance w15:val="hidden"/>
           <w:text/>
         </w:sdtPr>
+        <w:sdtEndPr/>
         <w:sdtContent>
           <w:r>
             <w:t xml:space="preserve">    </w:t>
           </w:r>
         </w:sdtContent>
       </w:sdt>
-      <w:permEnd w:id="182535402"/>
       <w:r>
         <w:t xml:space="preserve">   </w:t>
       </w:r>
@@ -2352,7 +2391,6 @@
         <w:t xml:space="preserve">. </w:t>
       </w:r>
     </w:p>
-    <w:permStart w:id="966666940" w:edGrp="everyone"/>
     <w:p>
       <w:pPr>
         <w:pStyle w:val="Comment-Grader"/>
@@ -2366,13 +2404,13 @@
           </w:placeholder>
           <w:text/>
         </w:sdtPr>
+        <w:sdtEndPr/>
         <w:sdtContent>
           <w:r>
             <w:t xml:space="preserve">    </w:t>
           </w:r>
         </w:sdtContent>
       </w:sdt>
-      <w:permEnd w:id="966666940"/>
       <w:r>
         <w:t xml:space="preserve">  </w:t>
       </w:r>
@@ -2402,7 +2440,6 @@
         <w:pStyle w:val="Ttulo1"/>
       </w:pPr>
       <w:r>
-        <w:lastRenderedPageBreak/>
         <w:t>SUPPLEMENTARY I</w:t>
       </w:r>
       <w:r>
@@ -2541,7 +2578,6 @@
         </w:rPr>
       </w:pPr>
       <w:r>
-        <w:lastRenderedPageBreak/>
         <w:t>SUPPLEMENTARY I</w:t>
       </w:r>
       <w:r>
@@ -2716,7 +2752,6 @@
         <w:t xml:space="preserve">. </w:t>
       </w:r>
     </w:p>
-    <w:permStart w:id="969371863" w:edGrp="everyone"/>
     <w:p>
       <w:pPr>
         <w:pStyle w:val="Comment-Grader"/>
@@ -2737,6 +2772,7 @@
           <w15:appearance w15:val="hidden"/>
           <w:text/>
         </w:sdtPr>
+        <w:sdtEndPr/>
         <w:sdtContent>
           <w:r>
             <w:rPr>
@@ -2746,7 +2782,6 @@
           </w:r>
         </w:sdtContent>
       </w:sdt>
-      <w:permEnd w:id="969371863"/>
       <w:r>
         <w:rPr>
           <w:lang w:val="en-US"/>
@@ -2821,7 +2856,6 @@
         <w:t xml:space="preserve"> </w:t>
       </w:r>
     </w:p>
-    <w:permStart w:id="693064756" w:edGrp="everyone"/>
     <w:p>
       <w:pPr>
         <w:pStyle w:val="Comment-Grader"/>
@@ -2836,13 +2870,19 @@
           <w15:appearance w15:val="hidden"/>
           <w:text/>
         </w:sdtPr>
+        <w:sdtEndPr/>
         <w:sdtContent>
           <w:r>
-            <w:t xml:space="preserve">    </w:t>
+            <w:t xml:space="preserve"> </w:t>
+          </w:r>
+          <w:r>
+            <w:t>X</w:t>
+          </w:r>
+          <w:r>
+            <w:t xml:space="preserve">  </w:t>
           </w:r>
         </w:sdtContent>
       </w:sdt>
-      <w:permEnd w:id="693064756"/>
       <w:r>
         <w:t xml:space="preserve">   </w:t>
       </w:r>
@@ -2852,7 +2892,6 @@
         <w:pStyle w:val="Ttulo1"/>
       </w:pPr>
       <w:r>
-        <w:lastRenderedPageBreak/>
         <w:t>SUPPLEMENTARY I</w:t>
       </w:r>
       <w:r>
@@ -2931,7 +2970,6 @@
         <w:t xml:space="preserve">. </w:t>
       </w:r>
     </w:p>
-    <w:permStart w:id="907674408" w:edGrp="everyone"/>
     <w:p>
       <w:pPr>
         <w:pStyle w:val="Comment-Grader"/>
@@ -2946,13 +2984,13 @@
           <w15:appearance w15:val="hidden"/>
           <w:text/>
         </w:sdtPr>
+        <w:sdtEndPr/>
         <w:sdtContent>
           <w:r>
             <w:t xml:space="preserve">    </w:t>
           </w:r>
         </w:sdtContent>
       </w:sdt>
-      <w:permEnd w:id="907674408"/>
       <w:r>
         <w:t xml:space="preserve">   </w:t>
       </w:r>
@@ -2996,7 +3034,6 @@
         <w:t xml:space="preserve">. </w:t>
       </w:r>
     </w:p>
-    <w:permStart w:id="1041122519" w:edGrp="everyone"/>
     <w:p>
       <w:pPr>
         <w:pStyle w:val="Comment-Grader"/>
@@ -3011,13 +3048,13 @@
           <w15:appearance w15:val="hidden"/>
           <w:text/>
         </w:sdtPr>
+        <w:sdtEndPr/>
         <w:sdtContent>
           <w:r>
             <w:t xml:space="preserve">    </w:t>
           </w:r>
         </w:sdtContent>
       </w:sdt>
-      <w:permEnd w:id="1041122519"/>
       <w:r>
         <w:t xml:space="preserve">   </w:t>
       </w:r>
@@ -3078,7 +3115,6 @@
         <w:t xml:space="preserve"> </w:t>
       </w:r>
     </w:p>
-    <w:permStart w:id="1706774679" w:edGrp="everyone"/>
     <w:p>
       <w:pPr>
         <w:pStyle w:val="Comment-Grader"/>
@@ -3093,13 +3129,13 @@
           <w15:appearance w15:val="hidden"/>
           <w:text/>
         </w:sdtPr>
+        <w:sdtEndPr/>
         <w:sdtContent>
           <w:r>
             <w:t xml:space="preserve">    </w:t>
           </w:r>
         </w:sdtContent>
       </w:sdt>
-      <w:permEnd w:id="1706774679"/>
       <w:r>
         <w:t xml:space="preserve">    </w:t>
       </w:r>
@@ -3146,7 +3182,6 @@
         <w:t xml:space="preserve">. </w:t>
       </w:r>
     </w:p>
-    <w:permStart w:id="1213296232" w:edGrp="everyone"/>
     <w:p>
       <w:pPr>
         <w:pStyle w:val="Comment-Grader"/>
@@ -3161,13 +3196,13 @@
           <w15:appearance w15:val="hidden"/>
           <w:text/>
         </w:sdtPr>
+        <w:sdtEndPr/>
         <w:sdtContent>
           <w:r>
             <w:t xml:space="preserve">    </w:t>
           </w:r>
         </w:sdtContent>
       </w:sdt>
-      <w:permEnd w:id="1213296232"/>
       <w:r>
         <w:t xml:space="preserve">    </w:t>
       </w:r>
@@ -3230,7 +3265,6 @@
         <w:t xml:space="preserve"> </w:t>
       </w:r>
     </w:p>
-    <w:permStart w:id="1335822965" w:edGrp="everyone"/>
     <w:p>
       <w:pPr>
         <w:pStyle w:val="Comment-Grader"/>
@@ -3244,13 +3278,13 @@
           </w:placeholder>
           <w:text/>
         </w:sdtPr>
+        <w:sdtEndPr/>
         <w:sdtContent>
           <w:r>
             <w:t xml:space="preserve">    </w:t>
           </w:r>
         </w:sdtContent>
       </w:sdt>
-      <w:permEnd w:id="1335822965"/>
       <w:r>
         <w:t xml:space="preserve">   </w:t>
       </w:r>
@@ -3260,7 +3294,6 @@
         <w:pStyle w:val="Ttulo1"/>
       </w:pPr>
       <w:r>
-        <w:lastRenderedPageBreak/>
         <w:t>SUPPLEMENTARY I</w:t>
       </w:r>
       <w:r>
@@ -3346,7 +3379,6 @@
         <w:t xml:space="preserve"> </w:t>
       </w:r>
     </w:p>
-    <w:permStart w:id="2020559059" w:edGrp="everyone"/>
     <w:p>
       <w:pPr>
         <w:pStyle w:val="Comment-Grader"/>
@@ -3361,13 +3393,13 @@
           <w15:appearance w15:val="hidden"/>
           <w:text/>
         </w:sdtPr>
+        <w:sdtEndPr/>
         <w:sdtContent>
           <w:r>
             <w:t xml:space="preserve">    </w:t>
           </w:r>
         </w:sdtContent>
       </w:sdt>
-      <w:permEnd w:id="2020559059"/>
       <w:r>
         <w:t xml:space="preserve">  </w:t>
       </w:r>
@@ -3391,7 +3423,6 @@
         <w:t xml:space="preserve">. </w:t>
       </w:r>
     </w:p>
-    <w:permStart w:id="1465457504" w:edGrp="everyone"/>
     <w:p>
       <w:pPr>
         <w:pStyle w:val="Comment-Grader"/>
@@ -3406,13 +3437,13 @@
           <w15:appearance w15:val="hidden"/>
           <w:text/>
         </w:sdtPr>
+        <w:sdtEndPr/>
         <w:sdtContent>
           <w:r>
             <w:t xml:space="preserve">    </w:t>
           </w:r>
         </w:sdtContent>
       </w:sdt>
-      <w:permEnd w:id="1465457504"/>
       <w:r>
         <w:t xml:space="preserve">   </w:t>
       </w:r>
@@ -3435,7 +3466,6 @@
         <w:pStyle w:val="Ttulo1"/>
       </w:pPr>
       <w:r>
-        <w:lastRenderedPageBreak/>
         <w:t>SUPPLEMENTARY II</w:t>
       </w:r>
       <w:r>
@@ -3531,7 +3561,6 @@
         <w:t xml:space="preserve">. </w:t>
       </w:r>
     </w:p>
-    <w:permStart w:id="122899937" w:edGrp="everyone"/>
     <w:p>
       <w:pPr>
         <w:pStyle w:val="Comment-Grader"/>
@@ -3546,13 +3575,13 @@
           <w15:appearance w15:val="hidden"/>
           <w:text/>
         </w:sdtPr>
+        <w:sdtEndPr/>
         <w:sdtContent>
           <w:r>
             <w:t xml:space="preserve">    </w:t>
           </w:r>
         </w:sdtContent>
       </w:sdt>
-      <w:permEnd w:id="122899937"/>
     </w:p>
     <w:p>
       <w:pPr>
@@ -3565,7 +3594,6 @@
         <w:t xml:space="preserve">. </w:t>
       </w:r>
     </w:p>
-    <w:permStart w:id="1353130504" w:edGrp="everyone"/>
     <w:p>
       <w:pPr>
         <w:pStyle w:val="Comment-Grader"/>
@@ -3580,13 +3608,13 @@
           <w15:appearance w15:val="hidden"/>
           <w:text/>
         </w:sdtPr>
+        <w:sdtEndPr/>
         <w:sdtContent>
           <w:r>
             <w:t xml:space="preserve">   </w:t>
           </w:r>
         </w:sdtContent>
       </w:sdt>
-      <w:permEnd w:id="1353130504"/>
     </w:p>
     <w:p/>
     <w:p/>
@@ -3612,7 +3640,6 @@
         </w:rPr>
       </w:pPr>
       <w:r>
-        <w:lastRenderedPageBreak/>
         <w:t>SUPPLEMENTARY II</w:t>
       </w:r>
       <w:r>
@@ -3692,7 +3719,6 @@
         <w:t>the students’ responsibility to find the appropriate service; no implicit or explicit liabilities shall be covered by the University of Seville or their individual affiliates if the students hire pay-per-use services!  The students are strongly advised to ensure that the service they choose is free of charge.</w:t>
       </w:r>
     </w:p>
-    <w:permStart w:id="1524918791" w:edGrp="everyone"/>
     <w:p>
       <w:pPr>
         <w:pStyle w:val="Comment-Grader"/>
@@ -3713,6 +3739,7 @@
           <w15:appearance w15:val="hidden"/>
           <w:text/>
         </w:sdtPr>
+        <w:sdtEndPr/>
         <w:sdtContent>
           <w:r>
             <w:rPr>
@@ -3722,7 +3749,6 @@
           </w:r>
         </w:sdtContent>
       </w:sdt>
-      <w:permEnd w:id="1524918791"/>
       <w:r>
         <w:rPr>
           <w:lang w:val="en-US"/>
@@ -3797,7 +3823,6 @@
         <w:t xml:space="preserve">. </w:t>
       </w:r>
     </w:p>
-    <w:permStart w:id="20847427" w:edGrp="everyone"/>
     <w:p>
       <w:pPr>
         <w:pStyle w:val="Comment-Grader"/>
@@ -3812,13 +3837,13 @@
           <w15:appearance w15:val="hidden"/>
           <w:text/>
         </w:sdtPr>
+        <w:sdtEndPr/>
         <w:sdtContent>
           <w:r>
             <w:t xml:space="preserve">    </w:t>
           </w:r>
         </w:sdtContent>
       </w:sdt>
-      <w:permEnd w:id="20847427"/>
       <w:r>
         <w:t xml:space="preserve">   </w:t>
       </w:r>
@@ -3834,7 +3859,6 @@
         <w:t xml:space="preserve">. </w:t>
       </w:r>
     </w:p>
-    <w:permStart w:id="1765168272" w:edGrp="everyone"/>
     <w:p>
       <w:pPr>
         <w:pStyle w:val="Comment-Grader"/>
@@ -3852,6 +3876,7 @@
           <w15:appearance w15:val="hidden"/>
           <w:text/>
         </w:sdtPr>
+        <w:sdtEndPr/>
         <w:sdtContent>
           <w:r>
             <w:rPr>
@@ -3861,7 +3886,6 @@
           </w:r>
         </w:sdtContent>
       </w:sdt>
-      <w:permEnd w:id="1765168272"/>
       <w:r>
         <w:rPr>
           <w:lang w:val="en-US"/>
@@ -3874,7 +3898,6 @@
         <w:pStyle w:val="Ttulo1"/>
       </w:pPr>
       <w:r>
-        <w:lastRenderedPageBreak/>
         <w:t>SUPPLEMENTARY II</w:t>
       </w:r>
       <w:r>
@@ -3973,7 +3996,6 @@
         <w:t xml:space="preserve">. </w:t>
       </w:r>
     </w:p>
-    <w:permStart w:id="1872234218" w:edGrp="everyone"/>
     <w:p>
       <w:pPr>
         <w:pStyle w:val="Comment-Grader"/>
@@ -3987,13 +4009,13 @@
           </w:placeholder>
           <w:text/>
         </w:sdtPr>
+        <w:sdtEndPr/>
         <w:sdtContent>
           <w:r>
             <w:t xml:space="preserve">    </w:t>
           </w:r>
         </w:sdtContent>
       </w:sdt>
-      <w:permEnd w:id="1872234218"/>
       <w:r>
         <w:t xml:space="preserve">   </w:t>
       </w:r>
@@ -4046,7 +4068,6 @@
         <w:t xml:space="preserve">. </w:t>
       </w:r>
     </w:p>
-    <w:permStart w:id="1729655514" w:edGrp="everyone"/>
     <w:p>
       <w:pPr>
         <w:pStyle w:val="Comment-Grader"/>
@@ -4060,13 +4081,13 @@
           </w:placeholder>
           <w:text/>
         </w:sdtPr>
+        <w:sdtEndPr/>
         <w:sdtContent>
           <w:r>
             <w:t xml:space="preserve">    </w:t>
           </w:r>
         </w:sdtContent>
       </w:sdt>
-      <w:permEnd w:id="1729655514"/>
       <w:r>
         <w:t xml:space="preserve">   </w:t>
       </w:r>
@@ -4122,7 +4143,6 @@
         <w:t xml:space="preserve">. </w:t>
       </w:r>
     </w:p>
-    <w:permStart w:id="268261008" w:edGrp="everyone"/>
     <w:p>
       <w:pPr>
         <w:pStyle w:val="Comment-Grader"/>
@@ -4137,13 +4157,13 @@
           <w15:appearance w15:val="hidden"/>
           <w:text/>
         </w:sdtPr>
+        <w:sdtEndPr/>
         <w:sdtContent>
           <w:r>
             <w:t xml:space="preserve">    </w:t>
           </w:r>
         </w:sdtContent>
       </w:sdt>
-      <w:permEnd w:id="268261008"/>
       <w:r>
         <w:t xml:space="preserve">    </w:t>
       </w:r>
@@ -4159,7 +4179,6 @@
         <w:t xml:space="preserve">. </w:t>
       </w:r>
     </w:p>
-    <w:permStart w:id="1057034605" w:edGrp="everyone"/>
     <w:p>
       <w:pPr>
         <w:pStyle w:val="Comment-Grader"/>
@@ -4179,6 +4198,7 @@
           </w:placeholder>
           <w:text/>
         </w:sdtPr>
+        <w:sdtEndPr/>
         <w:sdtContent>
           <w:r>
             <w:rPr>
@@ -4188,7 +4208,6 @@
           </w:r>
         </w:sdtContent>
       </w:sdt>
-      <w:permEnd w:id="1057034605"/>
       <w:r>
         <w:rPr>
           <w:lang w:val="en-US"/>
@@ -4211,7 +4230,6 @@
         <w:pStyle w:val="Ttulo1"/>
       </w:pPr>
       <w:r>
-        <w:lastRenderedPageBreak/>
         <w:t>SUPPLEMENTARY II</w:t>
       </w:r>
       <w:r>
@@ -4303,7 +4321,6 @@
         <w:t xml:space="preserve">. </w:t>
       </w:r>
     </w:p>
-    <w:permStart w:id="1476480654" w:edGrp="everyone"/>
     <w:p>
       <w:pPr>
         <w:pStyle w:val="Comment-Grader"/>
@@ -4318,13 +4335,13 @@
           <w15:appearance w15:val="hidden"/>
           <w:text/>
         </w:sdtPr>
+        <w:sdtEndPr/>
         <w:sdtContent>
           <w:r>
             <w:t xml:space="preserve">    </w:t>
           </w:r>
         </w:sdtContent>
       </w:sdt>
-      <w:permEnd w:id="1476480654"/>
       <w:r>
         <w:t xml:space="preserve">  </w:t>
       </w:r>
@@ -4348,7 +4365,6 @@
         <w:t xml:space="preserve">. </w:t>
       </w:r>
     </w:p>
-    <w:permStart w:id="95320382" w:edGrp="everyone"/>
     <w:p>
       <w:pPr>
         <w:pStyle w:val="Comment-Grader"/>
@@ -4362,13 +4378,13 @@
           </w:placeholder>
           <w:text/>
         </w:sdtPr>
+        <w:sdtEndPr/>
         <w:sdtContent>
           <w:r>
             <w:t xml:space="preserve">    </w:t>
           </w:r>
         </w:sdtContent>
       </w:sdt>
-      <w:permEnd w:id="95320382"/>
       <w:r>
         <w:t xml:space="preserve">   </w:t>
       </w:r>
@@ -4384,7 +4400,6 @@
         <w:t xml:space="preserve">. </w:t>
       </w:r>
     </w:p>
-    <w:permStart w:id="1440089446" w:edGrp="everyone"/>
     <w:p>
       <w:pPr>
         <w:pStyle w:val="Comment-Grader"/>
@@ -4398,13 +4413,13 @@
           </w:placeholder>
           <w:text/>
         </w:sdtPr>
+        <w:sdtEndPr/>
         <w:sdtContent>
           <w:r>
             <w:t xml:space="preserve">    </w:t>
           </w:r>
         </w:sdtContent>
       </w:sdt>
-      <w:permEnd w:id="1440089446"/>
       <w:r>
         <w:t xml:space="preserve">   </w:t>
       </w:r>
@@ -7454,9 +7469,11 @@
     <w:rsid w:val="00953D97"/>
     <w:rsid w:val="009D5AF9"/>
     <w:rsid w:val="00A222AC"/>
+    <w:rsid w:val="00A91DAC"/>
     <w:rsid w:val="00AC4502"/>
     <w:rsid w:val="00BA1063"/>
     <w:rsid w:val="00BE6430"/>
+    <w:rsid w:val="00C06C4F"/>
     <w:rsid w:val="00C42E76"/>
     <w:rsid w:val="00C63AB0"/>
     <w:rsid w:val="00D4788A"/>

</xml_diff>

<commit_message>
feat: :sparkles: Add Testing Report and Requirements
</commit_message>
<xml_diff>
--- a/reports/Student #3/03 - Requirements - Student #3.docx
+++ b/reports/Student #3/03 - Requirements - Student #3.docx
@@ -2263,7 +2263,13 @@
         </w:sdtPr>
         <w:sdtContent>
           <w:r>
-            <w:t xml:space="preserve">    </w:t>
+            <w:t xml:space="preserve"> </w:t>
+          </w:r>
+          <w:r>
+            <w:t>X</w:t>
+          </w:r>
+          <w:r>
+            <w:t xml:space="preserve">   </w:t>
           </w:r>
         </w:sdtContent>
       </w:sdt>
@@ -2348,7 +2354,13 @@
         </w:sdtPr>
         <w:sdtContent>
           <w:r>
-            <w:t xml:space="preserve">    </w:t>
+            <w:t xml:space="preserve"> </w:t>
+          </w:r>
+          <w:r>
+            <w:t>X</w:t>
+          </w:r>
+          <w:r>
+            <w:t xml:space="preserve">   </w:t>
           </w:r>
         </w:sdtContent>
       </w:sdt>
@@ -2402,7 +2414,13 @@
         </w:sdtPr>
         <w:sdtContent>
           <w:r>
-            <w:t xml:space="preserve">    </w:t>
+            <w:t xml:space="preserve">  </w:t>
+          </w:r>
+          <w:r>
+            <w:t>X</w:t>
+          </w:r>
+          <w:r>
+            <w:t xml:space="preserve">  </w:t>
           </w:r>
         </w:sdtContent>
       </w:sdt>
@@ -2438,7 +2456,13 @@
         </w:sdtPr>
         <w:sdtContent>
           <w:r>
-            <w:t xml:space="preserve">    </w:t>
+            <w:t xml:space="preserve">  </w:t>
+          </w:r>
+          <w:r>
+            <w:t>X</w:t>
+          </w:r>
+          <w:r>
+            <w:t xml:space="preserve">  </w:t>
           </w:r>
         </w:sdtContent>
       </w:sdt>
@@ -2812,7 +2836,19 @@
             <w:rPr>
               <w:lang w:val="en-US"/>
             </w:rPr>
-            <w:t xml:space="preserve">    </w:t>
+            <w:t xml:space="preserve">  </w:t>
+          </w:r>
+          <w:r>
+            <w:rPr>
+              <w:lang w:val="en-US"/>
+            </w:rPr>
+            <w:t>X</w:t>
+          </w:r>
+          <w:r>
+            <w:rPr>
+              <w:lang w:val="en-US"/>
+            </w:rPr>
+            <w:t xml:space="preserve">  </w:t>
           </w:r>
         </w:sdtContent>
       </w:sdt>
@@ -3036,7 +3072,13 @@
         </w:sdtPr>
         <w:sdtContent>
           <w:r>
-            <w:t xml:space="preserve">    </w:t>
+            <w:t xml:space="preserve">  </w:t>
+          </w:r>
+          <w:r>
+            <w:t>X</w:t>
+          </w:r>
+          <w:r>
+            <w:t xml:space="preserve">  </w:t>
           </w:r>
         </w:sdtContent>
       </w:sdt>
@@ -3101,7 +3143,13 @@
         </w:sdtPr>
         <w:sdtContent>
           <w:r>
-            <w:t xml:space="preserve">    </w:t>
+            <w:t xml:space="preserve"> </w:t>
+          </w:r>
+          <w:r>
+            <w:t>X</w:t>
+          </w:r>
+          <w:r>
+            <w:t xml:space="preserve">   </w:t>
           </w:r>
         </w:sdtContent>
       </w:sdt>
@@ -3183,7 +3231,13 @@
         </w:sdtPr>
         <w:sdtContent>
           <w:r>
-            <w:t xml:space="preserve">    </w:t>
+            <w:t xml:space="preserve"> </w:t>
+          </w:r>
+          <w:r>
+            <w:t>X</w:t>
+          </w:r>
+          <w:r>
+            <w:t xml:space="preserve">   </w:t>
           </w:r>
         </w:sdtContent>
       </w:sdt>
@@ -3251,7 +3305,13 @@
         </w:sdtPr>
         <w:sdtContent>
           <w:r>
-            <w:t xml:space="preserve">    </w:t>
+            <w:t xml:space="preserve">  </w:t>
+          </w:r>
+          <w:r>
+            <w:t>X</w:t>
+          </w:r>
+          <w:r>
+            <w:t xml:space="preserve">  </w:t>
           </w:r>
         </w:sdtContent>
       </w:sdt>
@@ -7455,7 +7515,6 @@
     <w:sig w:usb0="E4002EFF" w:usb1="C200247B" w:usb2="00000009" w:usb3="00000000" w:csb0="000001FF" w:csb1="00000000"/>
   </w:font>
   <w:font w:name="Yu Gothic Light">
-    <w:altName w:val="游ゴシック Light"/>
     <w:panose1 w:val="020B0300000000000000"/>
     <w:charset w:val="80"/>
     <w:family w:val="swiss"/>
@@ -7543,6 +7602,7 @@
     <w:rsid w:val="008830DB"/>
     <w:rsid w:val="008B1087"/>
     <w:rsid w:val="008D6165"/>
+    <w:rsid w:val="00943FF8"/>
     <w:rsid w:val="00953D97"/>
     <w:rsid w:val="009D5AF9"/>
     <w:rsid w:val="00A222AC"/>
@@ -7564,6 +7624,7 @@
     <w:rsid w:val="00E263A3"/>
     <w:rsid w:val="00E56863"/>
     <w:rsid w:val="00E955A7"/>
+    <w:rsid w:val="00E970E1"/>
     <w:rsid w:val="00EB74CB"/>
     <w:rsid w:val="00EC2C1B"/>
     <w:rsid w:val="00ED34A4"/>

</xml_diff>